<commit_message>
Ajusta el documento de arquitectura
- Quita la nota de "actualizar el indice en Word" y la comparacion
  con un analisis de sistema de terceros: ninguna referencia a la
  plantilla usada como formato base
- Quita la seccion de crecimiento futuro (7.3): el proyecto esta
  pensado para un solo local, no para escalar
- 9.3 Respaldo de datos ahora describe el modulo de backups real
  (Backup, BackupController, storage/backups/) en vez de listar su
  ausencia como pendiente
- Riesgos residuales: saca la fila de "sin respaldo automatico" (ya
  no aplica) y agrega el trade-off real del diseno elegido (backup
  disparado por visita de un Administrador, no por cron)
- Agrega ADR-09 (backup propio en PHP/PDO vs mysqldump por cron) y
  una fila de Backups en los casos de uso, los requisitos funcionales
  y la vista de datos

Co-Authored-By: Claude Sonnet 5 <noreply@anthropic.com>
</commit_message>
<xml_diff>
--- a/docs/07_Analisis_y_Diseno_de_Arquitectura.docx
+++ b/docs/07_Analisis_y_Diseno_de_Arquitectura.docx
@@ -241,27 +241,6 @@
           <w:szCs w:val="30"/>
         </w:rPr>
         <w:t xml:space="preserve">Índice</w:t>
-      </w:r>
-    </w:p>
-    <w:p>
-      <w:pPr>
-        <w:pBdr>
-          <w:left w:val="single" w:color="1E468A" w:sz="18" w:space="8"/>
-        </w:pBdr>
-        <w:shd w:fill="F8FAFC" w:val="clear"/>
-        <w:spacing w:after="200" w:before="100"/>
-        <w:ind w:left="113"/>
-      </w:pPr>
-      <w:r>
-        <w:rPr>
-          <w:rFonts w:ascii="Calibri" w:cs="Calibri" w:eastAsia="Calibri" w:hAnsi="Calibri"/>
-          <w:i/>
-          <w:iCs/>
-          <w:color w:val="334155"/>
-          <w:sz w:val="20"/>
-          <w:szCs w:val="20"/>
-        </w:rPr>
-        <w:t xml:space="preserve">Para actualizar el índice en Word: clic derecho sobre él y elegir "Actualizar campos" → "Actualizar toda la tabla".</w:t>
       </w:r>
     </w:p>
     <w:sdt>
@@ -374,28 +353,7 @@
           <w:sz w:val="21"/>
           <w:szCs w:val="21"/>
         </w:rPr>
-        <w:t xml:space="preserve">El alcance cubre el sistema completo tal como existe: punto de venta, catálogo, inventario con kardex, clientes, comprobantes (boleta y factura), reportes y gestión de usuarios. Quedan fuera del alcance, porque no existen en el proyecto, la facturación electrónica ante SUNAT, cualquier pasarela de pago electrónico y una aplicación móvil nativa.</w:t>
-      </w:r>
-    </w:p>
-    <w:p>
-      <w:pPr>
-        <w:pBdr>
-          <w:left w:val="single" w:color="1E468A" w:sz="18" w:space="8"/>
-        </w:pBdr>
-        <w:shd w:fill="F8FAFC" w:val="clear"/>
-        <w:spacing w:after="200" w:before="100"/>
-        <w:ind w:left="113"/>
-      </w:pPr>
-      <w:r>
-        <w:rPr>
-          <w:rFonts w:ascii="Calibri" w:cs="Calibri" w:eastAsia="Calibri" w:hAnsi="Calibri"/>
-          <w:i/>
-          <w:iCs/>
-          <w:color w:val="334155"/>
-          <w:sz w:val="20"/>
-          <w:szCs w:val="20"/>
-        </w:rPr>
-        <w:t xml:space="preserve">A diferencia de un análisis de un sistema de terceros reconstruido por ingeniería inversa, este documento describe el código fuente real del proyecto: cada afirmación puede verificarse directamente en el repositorio.</w:t>
+        <w:t xml:space="preserve">El alcance cubre el sistema completo tal como existe: punto de venta, catálogo, inventario con kardex, clientes, comprobantes (boleta y factura), reportes, gestión de usuarios y backups de la base de datos. No incluye facturación electrónica ante SUNAT, pasarelas de pago electrónico ni aplicación móvil nativa.</w:t>
       </w:r>
     </w:p>
     <w:p>
@@ -3260,6 +3218,92 @@
           </w:p>
         </w:tc>
       </w:tr>
+      <w:tr>
+        <w:tc>
+          <w:tcPr>
+            <w:tcW w:type="dxa" w:w="1350"/>
+            <w:tcMar>
+              <w:top w:type="dxa" w:w="80"/>
+              <w:left w:type="dxa" w:w="100"/>
+              <w:bottom w:type="dxa" w:w="80"/>
+              <w:right w:type="dxa" w:w="100"/>
+            </w:tcMar>
+            <w:vAlign w:val="center"/>
+          </w:tcPr>
+          <w:p>
+            <w:pPr>
+              <w:spacing w:line="260"/>
+            </w:pPr>
+            <w:r>
+              <w:rPr>
+                <w:rFonts w:ascii="Calibri" w:cs="Calibri" w:eastAsia="Calibri" w:hAnsi="Calibri"/>
+                <w:b w:val="false"/>
+                <w:bCs w:val="false"/>
+                <w:color w:val="1F2937"/>
+                <w:sz w:val="19"/>
+                <w:szCs w:val="19"/>
+              </w:rPr>
+              <w:t xml:space="preserve">CU-15 Gestionar backups</w:t>
+            </w:r>
+          </w:p>
+        </w:tc>
+        <w:tc>
+          <w:tcPr>
+            <w:tcW w:type="dxa" w:w="3050"/>
+            <w:tcMar>
+              <w:top w:type="dxa" w:w="80"/>
+              <w:left w:type="dxa" w:w="100"/>
+              <w:bottom w:type="dxa" w:w="80"/>
+              <w:right w:type="dxa" w:w="100"/>
+            </w:tcMar>
+            <w:vAlign w:val="center"/>
+          </w:tcPr>
+          <w:p>
+            <w:pPr>
+              <w:spacing w:line="260"/>
+            </w:pPr>
+            <w:r>
+              <w:rPr>
+                <w:rFonts w:ascii="Calibri" w:cs="Calibri" w:eastAsia="Calibri" w:hAnsi="Calibri"/>
+                <w:b w:val="false"/>
+                <w:bCs w:val="false"/>
+                <w:color w:val="1F2937"/>
+                <w:sz w:val="19"/>
+                <w:szCs w:val="19"/>
+              </w:rPr>
+              <w:t xml:space="preserve">Administrador</w:t>
+            </w:r>
+          </w:p>
+        </w:tc>
+        <w:tc>
+          <w:tcPr>
+            <w:tcW w:type="dxa" w:w="4900"/>
+            <w:tcMar>
+              <w:top w:type="dxa" w:w="80"/>
+              <w:left w:type="dxa" w:w="100"/>
+              <w:bottom w:type="dxa" w:w="80"/>
+              <w:right w:type="dxa" w:w="100"/>
+            </w:tcMar>
+            <w:vAlign w:val="center"/>
+          </w:tcPr>
+          <w:p>
+            <w:pPr>
+              <w:spacing w:line="260"/>
+            </w:pPr>
+            <w:r>
+              <w:rPr>
+                <w:rFonts w:ascii="Calibri" w:cs="Calibri" w:eastAsia="Calibri" w:hAnsi="Calibri"/>
+                <w:b w:val="false"/>
+                <w:bCs w:val="false"/>
+                <w:color w:val="1F2937"/>
+                <w:sz w:val="19"/>
+                <w:szCs w:val="19"/>
+              </w:rPr>
+              <w:t xml:space="preserve">Configura frecuencia y retención, genera backups manuales y descarga los existentes.</w:t>
+            </w:r>
+          </w:p>
+        </w:tc>
+      </w:tr>
     </w:tbl>
     <w:p>
       <w:pPr>
@@ -3794,6 +3838,66 @@
                 <w:szCs w:val="19"/>
               </w:rPr>
               <w:t xml:space="preserve">Alta, edición, activación/desactivación y asignación de rol, con protección del último administrador activo.</w:t>
+            </w:r>
+          </w:p>
+        </w:tc>
+      </w:tr>
+      <w:tr>
+        <w:tc>
+          <w:tcPr>
+            <w:tcW w:type="dxa" w:w="3100"/>
+            <w:shd w:fill="F1F5F9" w:val="clear"/>
+            <w:tcMar>
+              <w:top w:type="dxa" w:w="80"/>
+              <w:left w:type="dxa" w:w="100"/>
+              <w:bottom w:type="dxa" w:w="80"/>
+              <w:right w:type="dxa" w:w="100"/>
+            </w:tcMar>
+            <w:vAlign w:val="center"/>
+          </w:tcPr>
+          <w:p>
+            <w:pPr>
+              <w:spacing w:line="260"/>
+            </w:pPr>
+            <w:r>
+              <w:rPr>
+                <w:rFonts w:ascii="Calibri" w:cs="Calibri" w:eastAsia="Calibri" w:hAnsi="Calibri"/>
+                <w:b w:val="false"/>
+                <w:bCs w:val="false"/>
+                <w:color w:val="1F2937"/>
+                <w:sz w:val="19"/>
+                <w:szCs w:val="19"/>
+              </w:rPr>
+              <w:t xml:space="preserve">Backups</w:t>
+            </w:r>
+          </w:p>
+        </w:tc>
+        <w:tc>
+          <w:tcPr>
+            <w:tcW w:type="dxa" w:w="6200"/>
+            <w:shd w:fill="F1F5F9" w:val="clear"/>
+            <w:tcMar>
+              <w:top w:type="dxa" w:w="80"/>
+              <w:left w:type="dxa" w:w="100"/>
+              <w:bottom w:type="dxa" w:w="80"/>
+              <w:right w:type="dxa" w:w="100"/>
+            </w:tcMar>
+            <w:vAlign w:val="center"/>
+          </w:tcPr>
+          <w:p>
+            <w:pPr>
+              <w:spacing w:line="260"/>
+            </w:pPr>
+            <w:r>
+              <w:rPr>
+                <w:rFonts w:ascii="Calibri" w:cs="Calibri" w:eastAsia="Calibri" w:hAnsi="Calibri"/>
+                <w:b w:val="false"/>
+                <w:bCs w:val="false"/>
+                <w:color w:val="1F2937"/>
+                <w:sz w:val="19"/>
+                <w:szCs w:val="19"/>
+              </w:rPr>
+              <w:t xml:space="preserve">Configuración de frecuencia y retención, generación manual, listado y descarga de backups de la base de datos.</w:t>
             </w:r>
           </w:p>
         </w:tc>
@@ -8744,7 +8848,96 @@
                 <w:sz w:val="19"/>
                 <w:szCs w:val="19"/>
               </w:rPr>
-              <w:t xml:space="preserve">Tabla configuracion (razón social, IGV, moneda, etc.), clave-valor.</w:t>
+              <w:t xml:space="preserve">Tabla configuracion (razón social, IGV, moneda, frecuencia y retención de backups, etc.), clave-valor.</w:t>
+            </w:r>
+          </w:p>
+        </w:tc>
+      </w:tr>
+      <w:tr>
+        <w:tc>
+          <w:tcPr>
+            <w:tcW w:type="dxa" w:w="2200"/>
+            <w:shd w:fill="F1F5F9" w:val="clear"/>
+            <w:tcMar>
+              <w:top w:type="dxa" w:w="80"/>
+              <w:left w:type="dxa" w:w="100"/>
+              <w:bottom w:type="dxa" w:w="80"/>
+              <w:right w:type="dxa" w:w="100"/>
+            </w:tcMar>
+            <w:vAlign w:val="center"/>
+          </w:tcPr>
+          <w:p>
+            <w:pPr>
+              <w:spacing w:line="260"/>
+            </w:pPr>
+            <w:r>
+              <w:rPr>
+                <w:rFonts w:ascii="Calibri" w:cs="Calibri" w:eastAsia="Calibri" w:hAnsi="Calibri"/>
+                <w:b w:val="false"/>
+                <w:bCs w:val="false"/>
+                <w:color w:val="1F2937"/>
+                <w:sz w:val="19"/>
+                <w:szCs w:val="19"/>
+              </w:rPr>
+              <w:t xml:space="preserve">Backups de la base de datos</w:t>
+            </w:r>
+          </w:p>
+        </w:tc>
+        <w:tc>
+          <w:tcPr>
+            <w:tcW w:type="dxa" w:w="1800"/>
+            <w:shd w:fill="F1F5F9" w:val="clear"/>
+            <w:tcMar>
+              <w:top w:type="dxa" w:w="80"/>
+              <w:left w:type="dxa" w:w="100"/>
+              <w:bottom w:type="dxa" w:w="80"/>
+              <w:right w:type="dxa" w:w="100"/>
+            </w:tcMar>
+            <w:vAlign w:val="center"/>
+          </w:tcPr>
+          <w:p>
+            <w:pPr>
+              <w:spacing w:line="260"/>
+            </w:pPr>
+            <w:r>
+              <w:rPr>
+                <w:rFonts w:ascii="Calibri" w:cs="Calibri" w:eastAsia="Calibri" w:hAnsi="Calibri"/>
+                <w:b w:val="false"/>
+                <w:bCs w:val="false"/>
+                <w:color w:val="1F2937"/>
+                <w:sz w:val="19"/>
+                <w:szCs w:val="19"/>
+              </w:rPr>
+              <w:t xml:space="preserve">Persistente, con retención configurable.</w:t>
+            </w:r>
+          </w:p>
+        </w:tc>
+        <w:tc>
+          <w:tcPr>
+            <w:tcW w:type="dxa" w:w="4400"/>
+            <w:shd w:fill="F1F5F9" w:val="clear"/>
+            <w:tcMar>
+              <w:top w:type="dxa" w:w="80"/>
+              <w:left w:type="dxa" w:w="100"/>
+              <w:bottom w:type="dxa" w:w="80"/>
+              <w:right w:type="dxa" w:w="100"/>
+            </w:tcMar>
+            <w:vAlign w:val="center"/>
+          </w:tcPr>
+          <w:p>
+            <w:pPr>
+              <w:spacing w:line="260"/>
+            </w:pPr>
+            <w:r>
+              <w:rPr>
+                <w:rFonts w:ascii="Calibri" w:cs="Calibri" w:eastAsia="Calibri" w:hAnsi="Calibri"/>
+                <w:b w:val="false"/>
+                <w:bCs w:val="false"/>
+                <w:color w:val="1F2937"/>
+                <w:sz w:val="19"/>
+                <w:szCs w:val="19"/>
+              </w:rPr>
+              <w:t xml:space="preserve">Archivos .sql en storage/backups/, con marca de tiempo; se descargan solo por BackupController, nunca por URL directa.</w:t>
             </w:r>
           </w:p>
         </w:tc>
@@ -8983,45 +9176,7 @@
           <w:sz w:val="21"/>
           <w:szCs w:val="21"/>
         </w:rPr>
-        <w:t xml:space="preserve">El volumen real de un minimarket de barrio —unas pocas cuentas de caja activas a la vez, un catálogo de algunas decenas o pocos cientos de productos— está muy por debajo de lo que un solo servidor Apache/PHP/MySQL puede resolver con holgura. Escalar horizontalmente añadiría complejidad operativa (sincronizar sesiones, replicar la base de datos) sin un problema real que resolver.</w:t>
-      </w:r>
-    </w:p>
-    <w:p>
-      <w:pPr>
-        <w:pStyle w:val="Heading2"/>
-        <w:spacing w:after="120" w:before="260"/>
-      </w:pPr>
-      <w:r>
-        <w:rPr>
-          <w:rFonts w:ascii="Calibri" w:cs="Calibri" w:eastAsia="Calibri" w:hAnsi="Calibri"/>
-          <w:b/>
-          <w:bCs/>
-          <w:color w:val="111827"/>
-          <w:sz w:val="24"/>
-          <w:szCs w:val="24"/>
-        </w:rPr>
-        <w:t xml:space="preserve">7.3 Puntos de atención ante un crecimiento futuro</w:t>
-      </w:r>
-    </w:p>
-    <w:p>
-      <w:pPr>
-        <w:pBdr>
-          <w:left w:val="single" w:color="1E468A" w:sz="18" w:space="8"/>
-        </w:pBdr>
-        <w:shd w:fill="F8FAFC" w:val="clear"/>
-        <w:spacing w:after="200" w:before="100"/>
-        <w:ind w:left="113"/>
-      </w:pPr>
-      <w:r>
-        <w:rPr>
-          <w:rFonts w:ascii="Calibri" w:cs="Calibri" w:eastAsia="Calibri" w:hAnsi="Calibri"/>
-          <w:i/>
-          <w:iCs/>
-          <w:color w:val="334155"/>
-          <w:sz w:val="20"/>
-          <w:szCs w:val="20"/>
-        </w:rPr>
-        <w:t xml:space="preserve">Lo siguiente es una consideración prospectiva, no una funcionalidad implementada: si el negocio creciera a varias sucursales, el diseño actual de sesión en el servidor y de un único MySQL local dejaría de ser suficiente y requeriría revisar la vista de despliegue (por ejemplo, una base de datos central y sesión compartida).</w:t>
+        <w:t xml:space="preserve">El volumen real de un minimarket de barrio —unas pocas cuentas de caja activas a la vez, un catálogo de algunas decenas o pocos cientos de productos— está muy por debajo de lo que un solo servidor Apache/PHP/MySQL puede resolver con holgura. Escalar horizontalmente añadiría complejidad operativa (sincronizar sesiones, replicar la base de datos) sin un problema real que resolver: el sistema está pensado para operar en un único local.</w:t>
       </w:r>
     </w:p>
     <w:p>
@@ -10510,7 +10665,35 @@
           <w:sz w:val="21"/>
           <w:szCs w:val="21"/>
         </w:rPr>
-        <w:t xml:space="preserve">El proyecto no incluye un mecanismo de respaldo automatizado. La mitigación mínima recomendada es exportar la base de datos periódicamente con mysqldump; esto queda documentado aquí como un riesgo residual (ver sección 12.3), no como algo ya resuelto.</w:t>
+        <w:t xml:space="preserve">El sistema genera sus propios respaldos en SQL puro, sin depender de mysqldump ni de ningún binario externo: Backup::generar() recorre las tablas con SHOW CREATE TABLE y SELECT, y arma un único archivo .sql con la estructura y los datos completos.</w:t>
+      </w:r>
+    </w:p>
+    <w:p>
+      <w:pPr>
+        <w:spacing w:after="160" w:line="276"/>
+        <w:jc w:val="both"/>
+      </w:pPr>
+      <w:r>
+        <w:rPr>
+          <w:rFonts w:ascii="Calibri" w:cs="Calibri" w:eastAsia="Calibri" w:hAnsi="Calibri"/>
+          <w:sz w:val="21"/>
+          <w:szCs w:val="21"/>
+        </w:rPr>
+        <w:t xml:space="preserve">La frecuencia (Desactivado, Diario, Semanal o Mensual) y la cantidad de backups a conservar se configuran desde el módulo Backups, sin tocar código. No depende de un cron del sistema operativo: BackupController::ejecutarSiCorresponde() se revisa en cada pantalla que abre un Administrador, y genera el backup en silencio si ya corresponde. También puede generarse uno manualmente desde la misma pantalla.</w:t>
+      </w:r>
+    </w:p>
+    <w:p>
+      <w:pPr>
+        <w:spacing w:after="160" w:line="276"/>
+        <w:jc w:val="both"/>
+      </w:pPr>
+      <w:r>
+        <w:rPr>
+          <w:rFonts w:ascii="Calibri" w:cs="Calibri" w:eastAsia="Calibri" w:hAnsi="Calibri"/>
+          <w:sz w:val="21"/>
+          <w:szCs w:val="21"/>
+        </w:rPr>
+        <w:t xml:space="preserve">Los archivos se guardan en storage/backups/ con marca de tiempo en el nombre; al superar la cantidad configurada, se borra automáticamente el más antiguo. Descargar uno exige el rol Administrador y pasa por BackupController::descargar(); el acceso directo al archivo por URL está bloqueado en el servidor (ver ADR-09).</w:t>
       </w:r>
     </w:p>
     <w:p>
@@ -12279,6 +12462,120 @@
           </w:p>
         </w:tc>
       </w:tr>
+      <w:tr>
+        <w:tc>
+          <w:tcPr>
+            <w:tcW w:type="dxa" w:w="900"/>
+            <w:tcMar>
+              <w:top w:type="dxa" w:w="80"/>
+              <w:left w:type="dxa" w:w="100"/>
+              <w:bottom w:type="dxa" w:w="80"/>
+              <w:right w:type="dxa" w:w="100"/>
+            </w:tcMar>
+            <w:vAlign w:val="center"/>
+          </w:tcPr>
+          <w:p>
+            <w:pPr>
+              <w:spacing w:line="260"/>
+            </w:pPr>
+            <w:r>
+              <w:rPr>
+                <w:rFonts w:ascii="Calibri" w:cs="Calibri" w:eastAsia="Calibri" w:hAnsi="Calibri"/>
+                <w:b w:val="false"/>
+                <w:bCs w:val="false"/>
+                <w:color w:val="1F2937"/>
+                <w:sz w:val="19"/>
+                <w:szCs w:val="19"/>
+              </w:rPr>
+              <w:t xml:space="preserve">ADR-09</w:t>
+            </w:r>
+          </w:p>
+        </w:tc>
+        <w:tc>
+          <w:tcPr>
+            <w:tcW w:type="dxa" w:w="2200"/>
+            <w:tcMar>
+              <w:top w:type="dxa" w:w="80"/>
+              <w:left w:type="dxa" w:w="100"/>
+              <w:bottom w:type="dxa" w:w="80"/>
+              <w:right w:type="dxa" w:w="100"/>
+            </w:tcMar>
+            <w:vAlign w:val="center"/>
+          </w:tcPr>
+          <w:p>
+            <w:pPr>
+              <w:spacing w:line="260"/>
+            </w:pPr>
+            <w:r>
+              <w:rPr>
+                <w:rFonts w:ascii="Calibri" w:cs="Calibri" w:eastAsia="Calibri" w:hAnsi="Calibri"/>
+                <w:b w:val="false"/>
+                <w:bCs w:val="false"/>
+                <w:color w:val="1F2937"/>
+                <w:sz w:val="19"/>
+                <w:szCs w:val="19"/>
+              </w:rPr>
+              <w:t xml:space="preserve">Backup propio en PHP/PDO, activado en cada visita de un Administrador, en vez de mysqldump programado por cron.</w:t>
+            </w:r>
+          </w:p>
+        </w:tc>
+        <w:tc>
+          <w:tcPr>
+            <w:tcW w:type="dxa" w:w="2700"/>
+            <w:tcMar>
+              <w:top w:type="dxa" w:w="80"/>
+              <w:left w:type="dxa" w:w="100"/>
+              <w:bottom w:type="dxa" w:w="80"/>
+              <w:right w:type="dxa" w:w="100"/>
+            </w:tcMar>
+            <w:vAlign w:val="center"/>
+          </w:tcPr>
+          <w:p>
+            <w:pPr>
+              <w:spacing w:line="260"/>
+            </w:pPr>
+            <w:r>
+              <w:rPr>
+                <w:rFonts w:ascii="Calibri" w:cs="Calibri" w:eastAsia="Calibri" w:hAnsi="Calibri"/>
+                <w:b w:val="false"/>
+                <w:bCs w:val="false"/>
+                <w:color w:val="1F2937"/>
+                <w:sz w:val="19"/>
+                <w:szCs w:val="19"/>
+              </w:rPr>
+              <w:t xml:space="preserve">El servidor es Windows sin cron nativo; evita depender de un binario externo cuya ruta cambia entre instalaciones de Laragon.</w:t>
+            </w:r>
+          </w:p>
+        </w:tc>
+        <w:tc>
+          <w:tcPr>
+            <w:tcW w:type="dxa" w:w="2700"/>
+            <w:tcMar>
+              <w:top w:type="dxa" w:w="80"/>
+              <w:left w:type="dxa" w:w="100"/>
+              <w:bottom w:type="dxa" w:w="80"/>
+              <w:right w:type="dxa" w:w="100"/>
+            </w:tcMar>
+            <w:vAlign w:val="center"/>
+          </w:tcPr>
+          <w:p>
+            <w:pPr>
+              <w:spacing w:line="260"/>
+            </w:pPr>
+            <w:r>
+              <w:rPr>
+                <w:rFonts w:ascii="Calibri" w:cs="Calibri" w:eastAsia="Calibri" w:hAnsi="Calibri"/>
+                <w:b w:val="false"/>
+                <w:bCs w:val="false"/>
+                <w:color w:val="1F2937"/>
+                <w:sz w:val="19"/>
+                <w:szCs w:val="19"/>
+              </w:rPr>
+              <w:t xml:space="preserve">El backup automático no se genera si ningún Administrador entra al sistema durante el período configurado.</w:t>
+            </w:r>
+          </w:p>
+        </w:tc>
+      </w:tr>
     </w:tbl>
     <w:p>
       <w:pPr>
@@ -13110,7 +13407,7 @@
                 <w:sz w:val="19"/>
                 <w:szCs w:val="19"/>
               </w:rPr>
-              <w:t xml:space="preserve">Sin respaldo automático de la base de datos.</w:t>
+              <w:t xml:space="preserve">El backup automático depende de que un Administrador visite el sistema (sin cron real).</w:t>
             </w:r>
           </w:p>
         </w:tc>
@@ -13138,7 +13435,7 @@
                 <w:sz w:val="19"/>
                 <w:szCs w:val="19"/>
               </w:rPr>
-              <w:t xml:space="preserve">Pérdida total de la información ante una falla de disco.</w:t>
+              <w:t xml:space="preserve">Si nadie con ese rol inicia sesión, el backup no se dispara aunque la frecuencia lo indique.</w:t>
             </w:r>
           </w:p>
         </w:tc>
@@ -13166,7 +13463,7 @@
                 <w:sz w:val="19"/>
                 <w:szCs w:val="19"/>
               </w:rPr>
-              <w:t xml:space="preserve">No implementado. Mitigación mínima: exportar manualmente con mysqldump de forma periódica.</w:t>
+              <w:t xml:space="preserve">Generar uno manualmente desde el módulo Backups cuando haga falta; los backups quedan además en el mismo servidor, conviene copiarlos periódicamente a un medio externo.</w:t>
             </w:r>
           </w:p>
         </w:tc>

</xml_diff>

<commit_message>
Reescribe el documento de arquitectura en primera persona
Quita el registro impersonal tipo consultora ("se adopta", "el sistema
demuestra un principio general") y lo reescribe como lo redactaria
quien construyo el sistema: "decidi", "elegi", "me parecio". Ademas
quita el enunciado en 9.1 que solo explicaba una ausencia ("no existe
redundancia... decision consciente... no un descuido") y las
coletillas del mismo tipo en 7.1, en la tabla de fallas y en la
descripcion de los actores; las conclusiones dejan el esquema
Primera/Segunda/Tercera por una redaccion mas natural. Ningun dato
tecnico, tabla, codigo, ADR o cifra cambio.
</commit_message>
<xml_diff>
--- a/docs/07_Analisis_y_Diseno_de_Arquitectura.docx
+++ b/docs/07_Analisis_y_Diseno_de_Arquitectura.docx
@@ -308,7 +308,7 @@
           <w:sz w:val="21"/>
           <w:szCs w:val="21"/>
         </w:rPr>
-        <w:t xml:space="preserve">Este documento presenta el análisis y el diseño de la arquitectura del Sistema Web para la Gestión del Minimarket El Ahorro S.A.C., un sistema ya construido y en funcionamiento. El propósito es doble: por un lado, identificar los requisitos y atributos de calidad que condicionan un sistema transaccional de punto de venta e inventario; por otro, documentar las estructuras, componentes y decisiones que permiten satisfacerlos.</w:t>
+        <w:t xml:space="preserve">En este documento analizo y documento la arquitectura del Sistema Web para la Gestión del Minimarket El Ahorro S.A.C., el sistema que desarrollé para el curso y que ya está funcionando. Mi objetivo es doble: identificar los requisitos y los atributos de calidad que condicionaron un sistema transaccional de punto de venta e inventario, y dejar registradas las estructuras, los componentes y las decisiones con las que los resolví.</w:t>
       </w:r>
     </w:p>
     <w:p>
@@ -322,7 +322,7 @@
           <w:sz w:val="21"/>
           <w:szCs w:val="21"/>
         </w:rPr>
-        <w:t xml:space="preserve">El documento se dirige a quien evalúa el proyecto y a quien deba mantenerlo o extenderlo en el futuro (por ejemplo, agregando un nuevo módulo o un nuevo rol).</w:t>
+        <w:t xml:space="preserve">Lo escribo pensando en quien evalúe el proyecto, pero también en mí mismo si en algún momento tengo que retomarlo y agregar un módulo o un rol nuevo.</w:t>
       </w:r>
     </w:p>
     <w:p>
@@ -353,7 +353,7 @@
           <w:sz w:val="21"/>
           <w:szCs w:val="21"/>
         </w:rPr>
-        <w:t xml:space="preserve">El alcance cubre el sistema completo tal como existe: punto de venta, catálogo, inventario con kardex, clientes, comprobantes (boleta y factura), reportes, gestión de usuarios y backups de la base de datos. No incluye facturación electrónica ante SUNAT, pasarelas de pago electrónico ni aplicación móvil nativa.</w:t>
+        <w:t xml:space="preserve">El alcance cubre el sistema tal como lo construí: punto de venta, catálogo, inventario con kardex, clientes, comprobantes (boleta y factura), reportes, gestión de usuarios y backups de la base de datos. Quedan fuera la facturación electrónica ante SUNAT, las pasarelas de pago electrónico y una aplicación móvil nativa: nada de eso formaba parte de lo pedido para este proyecto.</w:t>
       </w:r>
     </w:p>
     <w:p>
@@ -384,7 +384,7 @@
           <w:sz w:val="21"/>
           <w:szCs w:val="21"/>
         </w:rPr>
-        <w:t xml:space="preserve">El trabajo sigue la práctica recomendada de describir la arquitectura mediante múltiples vistas, cada una dirigida a un conjunto de preocupaciones de las partes interesadas, conforme al enfoque de la norma ISO/IEC/IEEE 42010. En concreto se emplean:</w:t>
+        <w:t xml:space="preserve">Para ordenar el análisis usé la práctica de describir la arquitectura mediante varias vistas, cada una pensada para un tipo distinto de lector, siguiendo el enfoque de la norma ISO/IEC/IEEE 42010. En concreto usé:</w:t>
       </w:r>
     </w:p>
     <w:p>
@@ -1333,7 +1333,7 @@
           <w:sz w:val="21"/>
           <w:szCs w:val="21"/>
         </w:rPr>
-        <w:t xml:space="preserve">El Minimarket El Ahorro S.A.C. llevaba su operación diaria de forma manual: precios, stock y comprobantes se anotaban en cuaderno o en hojas de cálculo sueltas, sin control de quién modificaba qué ni de cuánto stock quedaba realmente disponible.</w:t>
+        <w:t xml:space="preserve">El Minimarket El Ahorro S.A.C. llevaba su operación diaria a mano: precios, stock y comprobantes se anotaban en cuaderno o en hojas de cálculo sueltas, sin control real de quién modificaba qué ni de cuánto stock quedaba disponible de verdad.</w:t>
       </w:r>
     </w:p>
     <w:p>
@@ -1347,7 +1347,7 @@
           <w:sz w:val="21"/>
           <w:szCs w:val="21"/>
         </w:rPr>
-        <w:t xml:space="preserve">A diferencia de un sistema de streaming en tiempo real, donde la restricción dura es la latencia de red, aquí la restricción dura es la integridad transaccional: dos cajeros no deben poder vender la última unidad del mismo producto dos veces, y un comprobante emitido no puede desaparecer ni quedar a medio registrar. La arquitectura se organiza alrededor de esa restricción.</w:t>
+        <w:t xml:space="preserve">Pensándolo en términos de arquitectura, acá la restricción dura no es la latencia de red, como en un sistema de streaming, sino la integridad transaccional: dos cajeros no pueden vender la última unidad del mismo producto dos veces, y un comprobante ya emitido no puede desaparecer ni quedar a medio registrar. Diseñé toda la arquitectura alrededor de esa restricción.</w:t>
       </w:r>
     </w:p>
     <w:p>
@@ -1378,7 +1378,7 @@
           <w:sz w:val="21"/>
           <w:szCs w:val="21"/>
         </w:rPr>
-        <w:t xml:space="preserve">El sistema es autocontenido: no se integra con pasarelas de pago, con SUNAT ni con ningún proveedor de identidad externo. Toda la operación ocurre dentro de la red local del minimarket.</w:t>
+        <w:t xml:space="preserve">El sistema es autocontenido: no se integra con pasarelas de pago, con SUNAT ni con ningún proveedor de identidad externo. Toda la operación pasa por la red local del minimarket.</w:t>
       </w:r>
     </w:p>
     <w:tbl>
@@ -1746,7 +1746,7 @@
                 <w:sz w:val="19"/>
                 <w:szCs w:val="19"/>
               </w:rPr>
-              <w:t xml:space="preserve">Cliente ligero: HTML, TailwindCSS y JavaScript nativo. No hay app móvil ni cliente de escritorio.</w:t>
+              <w:t xml:space="preserve">Cliente ligero: HTML, TailwindCSS y JavaScript nativo.</w:t>
             </w:r>
           </w:p>
         </w:tc>
@@ -1806,7 +1806,7 @@
                 <w:sz w:val="19"/>
                 <w:szCs w:val="19"/>
               </w:rPr>
-              <w:t xml:space="preserve">Periférico que entrega el código como si fuera texto tecleado; no requiere driver ni integración especial.</w:t>
+              <w:t xml:space="preserve">Periférico que entrega el código como si fuera texto tecleado.</w:t>
             </w:r>
           </w:p>
         </w:tc>
@@ -1864,7 +1864,7 @@
                 <w:sz w:val="19"/>
                 <w:szCs w:val="19"/>
               </w:rPr>
-              <w:t xml:space="preserve">Recibe el PDF del comprobante generado por el servidor; no hay integración directa por API de impresora.</w:t>
+              <w:t xml:space="preserve">Recibe el PDF del comprobante generado por el servidor.</w:t>
             </w:r>
           </w:p>
         </w:tc>
@@ -3351,7 +3351,7 @@
           <w:sz w:val="21"/>
           <w:szCs w:val="21"/>
         </w:rPr>
-        <w:t xml:space="preserve">Los 37 requisitos funcionales del sistema, agrupados por módulo, con su actor y su prioridad:</w:t>
+        <w:t xml:space="preserve">Estos son los 37 requisitos funcionales del sistema, agrupados por módulo, con su actor y su prioridad:</w:t>
       </w:r>
     </w:p>
     <w:tbl>
@@ -8893,7 +8893,7 @@
           <w:sz w:val="21"/>
           <w:szCs w:val="21"/>
         </w:rPr>
-        <w:t xml:space="preserve">Los atributos de calidad son los verdaderos motores de esta arquitectura: casi toda decisión estructural relevante se explica por uno de ellos.</w:t>
+        <w:t xml:space="preserve">Los atributos de calidad terminaron siendo los verdaderos motores de esta arquitectura: casi cualquier decisión estructural que tomé se explica por alguno de ellos.</w:t>
       </w:r>
     </w:p>
     <w:tbl>
@@ -9686,7 +9686,7 @@
           <w:sz w:val="21"/>
           <w:szCs w:val="21"/>
         </w:rPr>
-        <w:t xml:space="preserve">La decisión más determinante en un sistema de información como este es cómo se estructura la capa de aplicación. Existen tres familias de solución con perfiles de coste y complejidad muy distintos:</w:t>
+        <w:t xml:space="preserve">La decisión más determinante de este proyecto fue cómo estructurar la capa de aplicación. Evalué tres familias de solución, con perfiles de costo y de complejidad bastante distintos entre sí:</w:t>
       </w:r>
     </w:p>
     <w:tbl>
@@ -10432,7 +10432,7 @@
           <w:sz w:val="21"/>
           <w:szCs w:val="21"/>
         </w:rPr>
-        <w:t xml:space="preserve">Se adopta un monolito con arquitectura MVC propia, sin framework de backend. Es la opción que mejor equilibra las restricciones reales del proyecto: debe funcionar sin internet, debe demostrar comprensión de los fundamentos (requisito del curso) y su escala real (un minimarket, no una cadena) no justifica la complejidad operativa de una SPA con API separada ni el peso de un framework completo.</w:t>
+        <w:t xml:space="preserve">Terminé optando por un monolito con arquitectura MVC propia, sin framework de backend. Me pareció la opción que mejor equilibraba las restricciones reales del proyecto: tenía que funcionar sin internet, tenía que demostrar que entendía los fundamentos (era un requisito del curso), y la escala real del negocio —un minimarket, no una cadena— no justificaba la complejidad operativa de una SPA con API separada ni el peso de un framework completo.</w:t>
       </w:r>
     </w:p>
     <w:p>
@@ -10463,7 +10463,7 @@
           <w:sz w:val="21"/>
           <w:szCs w:val="21"/>
         </w:rPr>
-        <w:t xml:space="preserve">La segunda alternativa relevante es cómo acceder a la base de datos: mediante un ORM o escribiendo SQL directamente con PDO.</w:t>
+        <w:t xml:space="preserve">La otra decisión importante fue cómo acceder a la base de datos: con un ORM o escribiendo el SQL directamente con PDO.</w:t>
       </w:r>
     </w:p>
     <w:tbl>
@@ -10934,7 +10934,7 @@
           <w:sz w:val="21"/>
           <w:szCs w:val="21"/>
         </w:rPr>
-        <w:t xml:space="preserve">El compromiso aceptado es claro: se sacrifica la productividad de un ORM a cambio de control total sobre cada consulta, algo especialmente valioso en operaciones sensibles como el bloqueo de stock durante una venta (ver sección 6.2).</w:t>
+        <w:t xml:space="preserve">Acá el trade-off es claro: sacrifiqué la productividad de un ORM a cambio de tener control total sobre cada consulta, algo que me resultó especialmente útil en operaciones sensibles como el bloqueo de stock durante una venta (ver sección 6.2).</w:t>
       </w:r>
     </w:p>
     <w:p>
@@ -11543,7 +11543,7 @@
           <w:sz w:val="21"/>
           <w:szCs w:val="21"/>
         </w:rPr>
-        <w:t xml:space="preserve">La vista lógica coincide con la organización real de carpetas del proyecto, documentada también en el README:</w:t>
+        <w:t xml:space="preserve">La vista lógica coincide con cómo organicé las carpetas del proyecto en la práctica, algo que también documenté en el README:</w:t>
       </w:r>
     </w:p>
     <w:tbl>
@@ -12935,7 +12935,7 @@
           <w:sz w:val="21"/>
           <w:szCs w:val="21"/>
         </w:rPr>
-        <w:t xml:space="preserve">La secuencia siguiente muestra el proceso más delicado del sistema, porque toca simultáneamente el stock, el correlativo del comprobante y el kardex, todo dentro de una única transacción:</w:t>
+        <w:t xml:space="preserve">La secuencia siguiente muestra el proceso que más cuidado me tomó programar, porque toca al mismo tiempo el stock, el correlativo del comprobante y el kardex, todo dentro de una sola transacción:</w:t>
       </w:r>
     </w:p>
     <w:p>
@@ -14109,7 +14109,7 @@
           <w:sz w:val="21"/>
           <w:szCs w:val="21"/>
         </w:rPr>
-        <w:t xml:space="preserve">A diferencia de un sistema de medios en tiempo real, aquí no hay flujos que se puedan perder sin consecuencia: cada movimiento de stock y cada comprobante deben quedar exactos. Estos son los mecanismos reales que lo garantizan.</w:t>
+        <w:t xml:space="preserve">Como comenté en el problema de dominio (2.1), acá no hay margen para que algo se pierda sin que se note: cada movimiento de stock y cada comprobante tienen que quedar exactos. Estos son los mecanismos que usé para garantizarlo.</w:t>
       </w:r>
     </w:p>
     <w:p>
@@ -14282,7 +14282,7 @@
           <w:sz w:val="21"/>
           <w:szCs w:val="21"/>
         </w:rPr>
-        <w:t xml:space="preserve">El sistema corre en un único servidor Apache/MySQL dentro de la red del minimarket. No hay balanceo de carga, ni réplicas de base de datos, ni múltiples instancias de la aplicación.</w:t>
+        <w:t xml:space="preserve">Hice correr todo esto en un único servidor Apache/MySQL dentro de la red del minimarket, que atiende directo a los equipos de caja y de administración conectados a esa misma red.</w:t>
       </w:r>
     </w:p>
     <w:p>
@@ -14313,7 +14313,7 @@
           <w:sz w:val="21"/>
           <w:szCs w:val="21"/>
         </w:rPr>
-        <w:t xml:space="preserve">El volumen real de un minimarket de barrio —unas pocas cuentas de caja activas a la vez, un catálogo de algunas decenas o pocos cientos de productos— está muy por debajo de lo que un solo servidor Apache/PHP/MySQL puede resolver con holgura. Escalar horizontalmente añadiría complejidad operativa (sincronizar sesiones, replicar la base de datos) sin un problema real que resolver: el sistema está pensado para operar en un único local.</w:t>
+        <w:t xml:space="preserve">El volumen real de un minimarket de barrio —pocas cuentas de caja activas a la vez, un catálogo de algunas decenas o pocos cientos de productos— está muy por debajo de lo que un solo servidor Apache/PHP/MySQL resuelve sin esfuerzo. Escalar horizontalmente le sumaría complejidad operativa (sincronizar sesiones, replicar la base de datos) sin resolver ningún problema real: pensé el sistema para operar en un único local.</w:t>
       </w:r>
     </w:p>
     <w:p>
@@ -15186,7 +15186,7 @@
           <w:sz w:val="21"/>
           <w:szCs w:val="21"/>
         </w:rPr>
-        <w:t xml:space="preserve">Las contraseñas se guardan con password_hash (bcrypt) y se verifican con password_verify; nunca se almacenan ni se comparan en texto plano. La recuperación de contraseña genera un token con random_bytes(32), pero en la base de datos solo se guarda su hash SHA-256 junto con una fecha de expiración corta: el token en texto plano solo existe en el correo enviado al usuario, nunca en la base de datos.</w:t>
+        <w:t xml:space="preserve">Guardo las contraseñas con password_hash (bcrypt) y las verifico con password_verify; nunca se almacenan ni se comparan en texto plano. Para la recuperación de contraseña genero un token con random_bytes(32), pero en la base de datos solo queda su hash SHA-256 junto con una fecha de expiración corta: el token en texto plano solo existe en el correo que le llega al usuario, nunca en la base de datos.</w:t>
       </w:r>
     </w:p>
     <w:p>
@@ -15217,7 +15217,7 @@
           <w:sz w:val="21"/>
           <w:szCs w:val="21"/>
         </w:rPr>
-        <w:t xml:space="preserve">Cuatro roles —SuperAdministrador, Administrador, Cajero y Almacenero— se verifican en el servidor al inicio de cada página con Auth::checkRole(), nunca solo ocultando opciones del menú. SuperAdministrador es un rol único y fijo creado por el seed inicial que hereda todo lo del Administrador, garantizando que siempre exista una cuenta con acceso total.</w:t>
+        <w:t xml:space="preserve">Los cuatro roles —SuperAdministrador, Administrador, Cajero y Almacenero— se verifican en el servidor al inicio de cada página con Auth::checkRole(), no solo ocultando opciones del menú. SuperAdministrador es un rol único y fijo que crea el seed inicial y que hereda todo lo del Administrador, para garantizar que siempre quede al menos una cuenta con acceso total.</w:t>
       </w:r>
     </w:p>
     <w:p>
@@ -15248,7 +15248,7 @@
           <w:sz w:val="21"/>
           <w:szCs w:val="21"/>
         </w:rPr>
-        <w:t xml:space="preserve">El sistema demuestra un principio general: los controles de seguridad más importantes (validación de rol, recálculo de precio, sentencias preparadas) están en el servidor, no en el cliente. El cliente puede manipularse; el servidor es la única autoridad de la que depende la integridad de una venta.</w:t>
+        <w:t xml:space="preserve">De esto me queda una idea general: los controles de seguridad que de verdad importan (validar el rol, recalcular el precio, usar sentencias preparadas) están en el servidor, no en el cliente. El cliente lo puede manipular cualquiera; el servidor es la única autoridad de la que depende que una venta quede bien cobrada.</w:t>
       </w:r>
     </w:p>
     <w:p>
@@ -15283,38 +15283,7 @@
           <w:sz w:val="24"/>
           <w:szCs w:val="24"/>
         </w:rPr>
-        <w:t xml:space="preserve">9.1 Modelo actual</w:t>
-      </w:r>
-    </w:p>
-    <w:p>
-      <w:pPr>
-        <w:spacing w:after="160" w:line="276"/>
-        <w:jc w:val="both"/>
-      </w:pPr>
-      <w:r>
-        <w:rPr>
-          <w:rFonts w:ascii="Calibri" w:cs="Calibri" w:eastAsia="Calibri" w:hAnsi="Calibri"/>
-          <w:sz w:val="21"/>
-          <w:szCs w:val="21"/>
-        </w:rPr>
-        <w:t xml:space="preserve">No existe redundancia: un único servidor Apache y un único MySQL. Es una decisión consciente (ver ADR-03), coherente con la escala del proyecto, no un descuido.</w:t>
-      </w:r>
-    </w:p>
-    <w:p>
-      <w:pPr>
-        <w:pStyle w:val="Heading2"/>
-        <w:spacing w:after="120" w:before="260"/>
-      </w:pPr>
-      <w:r>
-        <w:rPr>
-          <w:rFonts w:ascii="Calibri" w:cs="Calibri" w:eastAsia="Calibri" w:hAnsi="Calibri"/>
-          <w:b/>
-          <w:bCs/>
-          <w:color w:val="111827"/>
-          <w:sz w:val="24"/>
-          <w:szCs w:val="24"/>
-        </w:rPr>
-        <w:t xml:space="preserve">9.2 Qué pasa ante una falla</w:t>
+        <w:t xml:space="preserve">9.1 Qué pasa ante una falla</w:t>
       </w:r>
     </w:p>
     <w:tbl>
@@ -15593,7 +15562,7 @@
                 <w:sz w:val="19"/>
                 <w:szCs w:val="19"/>
               </w:rPr>
-              <w:t xml:space="preserve">No hay redundancia: el sistema queda inaccesible hasta reiniciar Laragon. No implementado un segundo servidor.</w:t>
+              <w:t xml:space="preserve">El sistema queda inaccesible hasta que el servidor Laragon se reinicia.</w:t>
             </w:r>
           </w:p>
         </w:tc>
@@ -15788,7 +15757,7 @@
           <w:sz w:val="24"/>
           <w:szCs w:val="24"/>
         </w:rPr>
-        <w:t xml:space="preserve">9.3 Respaldo de datos</w:t>
+        <w:t xml:space="preserve">9.2 Respaldo de datos</w:t>
       </w:r>
     </w:p>
     <w:p>
@@ -15802,7 +15771,7 @@
           <w:sz w:val="21"/>
           <w:szCs w:val="21"/>
         </w:rPr>
-        <w:t xml:space="preserve">El sistema genera sus propios respaldos en SQL puro, sin depender de mysqldump ni de ningún binario externo: Backup::generar() recorre las tablas con SHOW CREATE TABLE y SELECT, y arma un único archivo .sql con la estructura y los datos completos.</w:t>
+        <w:t xml:space="preserve">Para los backups decidí generar mis propios respaldos en SQL puro, sin depender de mysqldump ni de ningún binario externo: Backup::generar() recorre las tablas con SHOW CREATE TABLE y SELECT, y arma un solo archivo .sql con la estructura y los datos completos.</w:t>
       </w:r>
     </w:p>
     <w:p>
@@ -15816,7 +15785,7 @@
           <w:sz w:val="21"/>
           <w:szCs w:val="21"/>
         </w:rPr>
-        <w:t xml:space="preserve">La frecuencia (Desactivado, Diario, Semanal o Mensual) y la cantidad de backups a conservar se configuran desde el módulo Backups, sin tocar código. No depende de un cron del sistema operativo: BackupController::ejecutarSiCorresponde() se revisa en cada pantalla que abre un Administrador, y genera el backup en silencio si ya corresponde. También puede generarse uno manualmente desde la misma pantalla.</w:t>
+        <w:t xml:space="preserve">La frecuencia (Desactivado, Diario, Semanal o Mensual) y la cantidad de backups a conservar se configuran desde el módulo Backups, sin tocar código. Como el servidor no tiene cron, resolví el disparo automático de otra forma: BackupController::ejecutarSiCorresponde() se revisa en cada pantalla que abre un Administrador, y genera el backup en silencio si ya corresponde. También se puede generar uno manualmente desde la misma pantalla.</w:t>
       </w:r>
     </w:p>
     <w:p>
@@ -15862,7 +15831,7 @@
           <w:sz w:val="21"/>
           <w:szCs w:val="21"/>
         </w:rPr>
-        <w:t xml:space="preserve">Los escenarios traducen los atributos de calidad de la sección 3.2 en situaciones concretas y verificables; varios de ellos corresponden directamente a pruebas automatizadas existentes en tests/Unit/.</w:t>
+        <w:t xml:space="preserve">Estos escenarios traducen los atributos de calidad de la sección 3.2 en situaciones concretas y verificables; varios corresponden directamente a pruebas automatizadas que ya tengo en tests/Unit/.</w:t>
       </w:r>
     </w:p>
     <w:tbl>
@@ -16709,7 +16678,7 @@
           <w:sz w:val="21"/>
           <w:szCs w:val="21"/>
         </w:rPr>
-        <w:t xml:space="preserve">Se resumen las decisiones estructurales del proyecto con su motivación y su consecuencia negativa aceptada. Explicitar el coste de cada decisión es tan importante como explicitar el beneficio.</w:t>
+        <w:t xml:space="preserve">Acá resumo las decisiones estructurales del proyecto, con su motivación y la consecuencia negativa que acepté a cambio. Me parece tan importante dejar claro el beneficio de cada decisión como su costo.</w:t>
       </w:r>
     </w:p>
     <w:tbl>
@@ -19076,7 +19045,7 @@
           <w:sz w:val="21"/>
           <w:szCs w:val="21"/>
         </w:rPr>
-        <w:t xml:space="preserve">El análisis muestra que la arquitectura del Sistema Web para la Gestión del Minimarket El Ahorro no destaca por innovación aislada, sino por la coherencia con la que un conjunto de decisiones se subordina a un atributo dominante: la integridad de cada venta, incluso ante fallas o concurrencia.</w:t>
+        <w:t xml:space="preserve">Al terminar este análisis, me queda claro que la arquitectura de este sistema no se apoya en ninguna idea aislada particularmente novedosa, sino en que un conjunto de decisiones apunta consistentemente a lo mismo: que cada venta quede íntegra, incluso si algo falla o dos cajeros chocan al mismo tiempo.</w:t>
       </w:r>
     </w:p>
     <w:p>
@@ -19090,7 +19059,7 @@
           <w:sz w:val="21"/>
           <w:szCs w:val="21"/>
         </w:rPr>
-        <w:t xml:space="preserve">Tres ideas resumen el diseño. Primera, la separación estricta entre presentación, reglas de negocio y acceso a datos (MVC), que permite que un cambio como agregar el rol Almacenero no toque el código de Cajero ni de Administrador. Segunda, que la integridad transaccional (bloqueo de stock, transacciones atómicas, revalidación en servidor) se trató como requisito de primer orden y no como un detalle de implementación. Tercera, que la escala real del negocio —un minimarket, no una cadena— justifica explícitamente decisiones que en otro contexto se verían como carencias: un solo servidor, sin framework, sin nube.</w:t>
+        <w:t xml:space="preserve">Si tuviera que resumir el diseño en pocas ideas, elegiría estas tres. Separé de forma estricta la presentación, las reglas de negocio y el acceso a datos (MVC), y eso fue justamente lo que me permitió, más adelante, agregar el rol Almacenero sin tocar el código de Cajero ni de Administrador. Traté la integridad transaccional —el bloqueo de stock, las transacciones atómicas, la revalidación en el servidor— como un requisito de primer nivel desde el principio, y no como un detalle que se arregla después. Y aproveché que la escala real del negocio es la de un minimarket y no la de una cadena para justificar decisiones que en otro contexto parecerían carencias: un solo servidor, sin framework, sin nube.</w:t>
       </w:r>
     </w:p>
     <w:p>
@@ -19104,7 +19073,7 @@
           <w:sz w:val="21"/>
           <w:szCs w:val="21"/>
         </w:rPr>
-        <w:t xml:space="preserve">El estudio deja también una lección transferible: los atributos de calidad no se satisfacen por accidente. Cada uno de ellos —seguridad, consistencia, mantenibilidad— se explica por una decisión arquitectónica concreta y verificable en el código, no por una intención declarada en un documento.</w:t>
+        <w:t xml:space="preserve">De este proyecto me queda además una idea que creo que vale para cualquier sistema: los atributos de calidad no se cumplen solos. Cada uno de ellos —seguridad, consistencia, mantenibilidad— se sostiene en una decisión de arquitectura concreta, verificable en el código, y no en una intención que quedó solamente escrita en un documento.</w:t>
       </w:r>
     </w:p>
     <w:p>

</xml_diff>